<commit_message>
Huck: Parte 1 com ritmo mais calmo
Co-Authored-By: Claude Opus 5.5 <noreply@anthropic.com>
Claude-Session: https://claude.ai/code/session_01MJjUEEZrxQDEUifKK2vj9g
</commit_message>
<xml_diff>
--- a/roteiros/luciano-huck/Huck_Parte1.docx
+++ b/roteiros/luciano-huck/Huck_Parte1.docx
@@ -55,7 +55,7 @@
         <w:rPr>
           <w:color w:val="000000"/>
         </w:rPr>
-        <w:t>Ele nasceu em São Paulo, em setembro de mil novecentos e setenta e um. Filho de um advogado e de uma urbanista. Estudou Direito na Universidade de São Paulo.</w:t>
+        <w:t>Pense num sábado à tarde, no começo dos anos dois mil. Era mais ou menos assim que acontecia.</w:t>
       </w:r>
     </w:p>
     <w:p>
@@ -63,7 +63,7 @@
         <w:rPr>
           <w:color w:val="000000"/>
         </w:rPr>
-        <w:t>Era um rapaz de família rica, que poderia ter seguido o caminho do pai.</w:t>
+        <w:t>A televisão está ligada na sala. A família almoçou, alguém cochila no sofá, as crianças brincam no chão. E, na tela, aparece um rapaz alto, magro, de sorriso largo, entrando na casa de uma família pobre.</w:t>
       </w:r>
     </w:p>
     <w:p>
@@ -71,7 +71,7 @@
         <w:rPr>
           <w:color w:val="000000"/>
         </w:rPr>
-        <w:t>Escolheu a televisão.</w:t>
+        <w:t>A casa está caindo aos pedaços. O teto tem goteira. A parede tem rachadura. A mãe conta, com vergonha, que os filhos dormem todos no mesmo colchão.</w:t>
       </w:r>
     </w:p>
     <w:p>
@@ -79,7 +79,7 @@
         <w:rPr>
           <w:color w:val="000000"/>
         </w:rPr>
-        <w:t>Começou escrevendo uma coluna sobre a vida noturna jovem num jornal de São Paulo. Passou pelo rádio. Em mil novecentos e noventa e seis, ganhou um programa na Band, voltado para adolescentes.</w:t>
+        <w:t>Semanas depois, a mesma família volta para casa de olhos vendados.</w:t>
       </w:r>
     </w:p>
     <w:p>
@@ -87,7 +87,7 @@
         <w:rPr>
           <w:color w:val="000000"/>
         </w:rPr>
-        <w:t>Em abril de dois mil, chegou à Globo.</w:t>
+        <w:t>Quando a venda cai, a casa está nova. Móveis novos. Quarto para as crianças. A mãe chora. O pai não consegue falar. E o rapaz alto está ali do lado, abraçando todo mundo, também emocionado.</w:t>
       </w:r>
     </w:p>
     <w:p>
@@ -95,7 +95,7 @@
         <w:rPr>
           <w:color w:val="000000"/>
         </w:rPr>
-        <w:t>O programa se chamava Caldeirão do Huck. E foi ali que nasceu a imagem que o acompanharia por mais de vinte anos.</w:t>
+        <w:t>Esse rapaz era Luciano Huck. E o programa era o Caldeirão do Huck, que estreou na Globo em abril de dois mil.</w:t>
       </w:r>
     </w:p>
     <w:p>
@@ -103,23 +103,7 @@
         <w:rPr>
           <w:color w:val="000000"/>
         </w:rPr>
-        <w:t>Todo sábado à tarde, o Brasil via Luciano Huck entrar na casa de uma família humilde e mudar a vida dela.</w:t>
-      </w:r>
-    </w:p>
-    <w:p>
-      <w:r>
-        <w:rPr>
-          <w:color w:val="000000"/>
-        </w:rPr>
-        <w:t>Uma casa caindo aos pedaços virava casa nova. Um carro velho, quase sem condições de rodar, voltava reformado para o dono. Gente que nunca tinha tido nada chorava diante da câmera.</w:t>
-      </w:r>
-    </w:p>
-    <w:p>
-      <w:r>
-        <w:rPr>
-          <w:color w:val="000000"/>
-        </w:rPr>
-        <w:t>E, no meio de cada cena, estava ele. Abraçando. Emocionado. Prometendo que a vida daquela família ia ser outra a partir dali.</w:t>
+        <w:t>Durante mais de vinte anos, o Brasil inteiro se acostumou com essa cena. Casas reformadas, carros velhos que voltavam novinhos para os donos. Gente simples que, por um dia, via a vida virar.</w:t>
       </w:r>
     </w:p>
     <w:p>
@@ -135,7 +119,7 @@
         <w:rPr>
           <w:color w:val="000000"/>
         </w:rPr>
-        <w:t>O público comprou aquela imagem.</w:t>
+        <w:t>Só que o próprio Luciano Huck nunca tinha passado por nada parecido com aquilo.</w:t>
       </w:r>
     </w:p>
     <w:p>
@@ -143,7 +127,7 @@
         <w:rPr>
           <w:color w:val="000000"/>
         </w:rPr>
-        <w:t>Em dois mil e quatro, Huck se casou com a apresentadora Angélica. Os dois tiveram três filhos. Viraram um dos casais mais conhecidos do país.</w:t>
+        <w:t>Ele nasceu em São Paulo, em setembro de mil novecentos e setenta e um. O pai era advogado. A mãe, urbanista. Cresceu numa família com dinheiro, estudou Direito na Universidade de São Paulo.</w:t>
       </w:r>
     </w:p>
     <w:p>
@@ -151,7 +135,7 @@
         <w:rPr>
           <w:color w:val="000000"/>
         </w:rPr>
-        <w:t>No mesmo ano, ele criou um instituto social, voltado para jovens de baixa renda.</w:t>
+        <w:t>Podia ter virado advogado, como o pai. Escolheu a televisão.</w:t>
       </w:r>
     </w:p>
     <w:p>
@@ -159,7 +143,7 @@
         <w:rPr>
           <w:color w:val="000000"/>
         </w:rPr>
-        <w:t>A imagem de bom moço ficou tão forte que começou a sair da televisão.</w:t>
+        <w:t>Começou com uma coluna sobre a noite jovem num jornal de São Paulo. Passou pelo rádio. Teve um programa para adolescentes na Band. E, aos vinte e oito anos, chegou à maior emissora do país.</w:t>
       </w:r>
     </w:p>
     <w:p>
@@ -167,7 +151,7 @@
         <w:rPr>
           <w:color w:val="000000"/>
         </w:rPr>
-        <w:t>Em dois mil e dezoito, o nome de Luciano Huck apareceu nas conversas de partidos como possível candidato a presidente da República. Ele chegou a conversar com partidos, mas desistiu.</w:t>
+        <w:t>Em dois mil e quatro, casou com a apresentadora Angélica. Os dois tiveram três filhos e viraram um dos casais mais queridos do Brasil.</w:t>
       </w:r>
     </w:p>
     <w:p>
@@ -175,7 +159,7 @@
         <w:rPr>
           <w:color w:val="000000"/>
         </w:rPr>
-        <w:t>Em dois mil e vinte e dois, a mesma coisa. O nome voltou a circular. Ele de novo recuou.</w:t>
+        <w:t>No mesmo ano, ele criou um instituto para ensinar jovens de baixa renda a trabalhar com cinema e televisão.</w:t>
       </w:r>
     </w:p>
     <w:p>
@@ -183,7 +167,7 @@
         <w:rPr>
           <w:color w:val="000000"/>
         </w:rPr>
-        <w:t>Mas a ideia nunca foi embora por completo.</w:t>
+        <w:t>Aos poucos, a imagem do apresentador foi crescendo para além da TV.</w:t>
       </w:r>
     </w:p>
     <w:p>
@@ -191,7 +175,7 @@
         <w:rPr>
           <w:color w:val="000000"/>
         </w:rPr>
-        <w:t>Em setembro de dois mil e vinte e um, a Globo deu a ele o lugar mais disputado da televisão brasileira.</w:t>
+        <w:t>Muita gente começou a ver nele alguém que entendia o Brasil pobre. Alguém em quem dava para confiar.</w:t>
       </w:r>
     </w:p>
     <w:p>
@@ -199,7 +183,15 @@
         <w:rPr>
           <w:color w:val="000000"/>
         </w:rPr>
-        <w:t>O domingo.</w:t>
+        <w:t>E, quando um rosto inspira esse tipo de confiança, os políticos percebem.</w:t>
+      </w:r>
+    </w:p>
+    <w:p>
+      <w:r>
+        <w:rPr>
+          <w:color w:val="C00000"/>
+        </w:rPr>
+        <w:t>Foi aí que Luciano Huck começou a sonhar com algo muito maior do que um programa de sábado. E é esse sonho que torna o segredo dele ainda mais perigoso.</w:t>
       </w:r>
     </w:p>
     <w:p>
@@ -207,7 +199,71 @@
         <w:rPr>
           <w:color w:val="000000"/>
         </w:rPr>
-        <w:t>Faustão tinha deixado a emissora depois de mais de trinta anos. E quem herdou o horário foi Luciano Huck.</w:t>
+        <w:t>Em dois mil e dezoito, o nome dele começou a aparecer nas conversas de partidos como possível candidato a presidente da República.</w:t>
+      </w:r>
+    </w:p>
+    <w:p>
+      <w:r>
+        <w:rPr>
+          <w:color w:val="000000"/>
+        </w:rPr>
+        <w:t>Pense nisso por um segundo. Um apresentador de televisão, sem nenhum cargo político, sendo cotado para governar o país.</w:t>
+      </w:r>
+    </w:p>
+    <w:p>
+      <w:r>
+        <w:rPr>
+          <w:color w:val="000000"/>
+        </w:rPr>
+        <w:t>Ele chegou a conversar com partidos. Mas desistiu.</w:t>
+      </w:r>
+    </w:p>
+    <w:p>
+      <w:r>
+        <w:rPr>
+          <w:color w:val="000000"/>
+        </w:rPr>
+        <w:t>Quatro anos depois, em dois mil e vinte e dois, a história se repetiu. O nome voltou a circular. E ele, de novo, recuou.</w:t>
+      </w:r>
+    </w:p>
+    <w:p>
+      <w:r>
+        <w:rPr>
+          <w:color w:val="000000"/>
+        </w:rPr>
+        <w:t>A ideia, porém, nunca foi embora por completo.</w:t>
+      </w:r>
+    </w:p>
+    <w:p>
+      <w:r>
+        <w:rPr>
+          <w:color w:val="000000"/>
+        </w:rPr>
+        <w:t>Enquanto isso, a carreira na televisão chegava ao ponto mais alto.</w:t>
+      </w:r>
+    </w:p>
+    <w:p>
+      <w:r>
+        <w:rPr>
+          <w:color w:val="000000"/>
+        </w:rPr>
+        <w:t>Em setembro de dois mil e vinte e um, Faustão deixou a Globo depois de mais de trinta anos no ar. Os domingos à tarde, que por três décadas tinham sido dele, ficaram vazios.</w:t>
+      </w:r>
+    </w:p>
+    <w:p>
+      <w:r>
+        <w:rPr>
+          <w:color w:val="000000"/>
+        </w:rPr>
+        <w:t>A Globo escolheu Luciano Huck para ocupar aquele lugar.</w:t>
+      </w:r>
+    </w:p>
+    <w:p>
+      <w:r>
+        <w:rPr>
+          <w:color w:val="000000"/>
+        </w:rPr>
+        <w:t>Para quem não acompanha televisão, é difícil explicar o peso disso. O domingo à tarde é o horário em que a família inteira está em casa. É o espaço mais valioso da TV brasileira. Quem senta naquela cadeira entra, toda semana, na sala de dezenas de milhões de pessoas.</w:t>
       </w:r>
     </w:p>
     <w:p>
@@ -223,7 +279,7 @@
         <w:rPr>
           <w:color w:val="000000"/>
         </w:rPr>
-        <w:t>Agora, o rosto dele entrava na casa de milhões de famílias, todo fim de semana, no horário mais nobre da TV.</w:t>
+        <w:t>O rapaz do sábado tinha virado o homem do domingo.</w:t>
       </w:r>
     </w:p>
     <w:p>
@@ -231,7 +287,7 @@
         <w:rPr>
           <w:color w:val="C00000"/>
         </w:rPr>
-        <w:t>E foi justamente no auge, sentado na cadeira mais poderosa da televisão brasileira, que Luciano Huck conheceu o homem que ia colocar tudo isso em risco. Um homem que, na época, era visto como um dos banqueiros que mais cresciam no país.</w:t>
+        <w:t>E foi justamente no auge, sentado na cadeira mais poderosa da televisão brasileira, que Luciano Huck conheceu o homem que ia colocar tudo isso em risco.</w:t>
       </w:r>
     </w:p>
     <w:p>
@@ -247,7 +303,7 @@
         <w:rPr>
           <w:color w:val="000000"/>
         </w:rPr>
-        <w:t>Vorcaro era dono de um banco chamado Banco Master, com sede na Avenida Faria Lima, em São Paulo, o coração do dinheiro no Brasil.</w:t>
+        <w:t>Na época, quase ninguém fora do mercado financeiro sabia quem ele era.</w:t>
       </w:r>
     </w:p>
     <w:p>
@@ -255,7 +311,7 @@
         <w:rPr>
           <w:color w:val="000000"/>
         </w:rPr>
-        <w:t>O banco cresceu rápido. Rápido demais.</w:t>
+        <w:t>Vorcaro era dono de um banco chamado Banco Master, com sede na Avenida Faria Lima, em São Paulo. É a avenida dos grandes bancos, dos fundos de investimento, do dinheiro grande do país.</w:t>
       </w:r>
     </w:p>
     <w:p>
@@ -263,7 +319,7 @@
         <w:rPr>
           <w:color w:val="000000"/>
         </w:rPr>
-        <w:t>O segredo do crescimento era simples. O Master oferecia aos clientes investimentos que pagavam juros muito acima dos outros bancos. Muita gente colocou ali as economias de uma vida.</w:t>
+        <w:t>O Master cresceu rápido. Muito rápido.</w:t>
       </w:r>
     </w:p>
     <w:p>
@@ -271,7 +327,7 @@
         <w:rPr>
           <w:color w:val="000000"/>
         </w:rPr>
-        <w:t>Vorcaro virou figura conhecida entre empresários e políticos. Voava de jatinho particular.</w:t>
+        <w:t>E o motivo era fácil de entender, até para quem não entende nada de banco.</w:t>
       </w:r>
     </w:p>
     <w:p>
@@ -279,7 +335,31 @@
         <w:rPr>
           <w:color w:val="000000"/>
         </w:rPr>
-        <w:t>E, a partir de novembro de dois mil e vinte e três, passou a ter também o número de telefone de Luciano Huck.</w:t>
+        <w:t>Imagine que você tem um dinheiro guardado. Um banco grande paga um pouquinho de rendimento por ele. Aí aparece outro banco, menos conhecido, prometendo pagar bem mais. E ainda dizendo que o seu dinheiro está protegido.</w:t>
+      </w:r>
+    </w:p>
+    <w:p>
+      <w:r>
+        <w:rPr>
+          <w:color w:val="000000"/>
+        </w:rPr>
+        <w:t>Foi isso que o Master fez. Oferecia investimentos com rendimento muito acima dos outros. E muita gente comum colocou ali as economias de uma vida.</w:t>
+      </w:r>
+    </w:p>
+    <w:p>
+      <w:r>
+        <w:rPr>
+          <w:color w:val="000000"/>
+        </w:rPr>
+        <w:t>O banco cresceu. E Vorcaro cresceu junto. Virou figura conhecida entre empresários e políticos. Voava de jatinho particular.</w:t>
+      </w:r>
+    </w:p>
+    <w:p>
+      <w:r>
+        <w:rPr>
+          <w:color w:val="000000"/>
+        </w:rPr>
+        <w:t>A partir de novembro de dois mil e vinte e três, ele também passou a ter o número de telefone de Luciano Huck.</w:t>
       </w:r>
     </w:p>
     <w:p>
@@ -295,7 +375,7 @@
         <w:rPr>
           <w:color w:val="000000"/>
         </w:rPr>
-        <w:t>Ninguém de fora sabia o que estava escrito ali.</w:t>
+        <w:t>Ninguém de fora sabia o que estava escrito ali. Nem os telespectadores do domingo, nem os eleitores que imaginavam Huck um dia como candidato.</w:t>
       </w:r>
     </w:p>
     <w:p>
@@ -303,7 +383,23 @@
         <w:rPr>
           <w:color w:val="000000"/>
         </w:rPr>
-        <w:t>Até que, em novembro de dois mil e vinte e cinco, Vorcaro foi preso pela Polícia Federal. E o celular dele foi apreendido.</w:t>
+        <w:t>Até que, em novembro de dois mil e vinte e cinco, tudo mudou.</w:t>
+      </w:r>
+    </w:p>
+    <w:p>
+      <w:r>
+        <w:rPr>
+          <w:color w:val="000000"/>
+        </w:rPr>
+        <w:t>Vorcaro foi preso pela Polícia Federal. E o celular dele foi apreendido.</w:t>
+      </w:r>
+    </w:p>
+    <w:p>
+      <w:r>
+        <w:rPr>
+          <w:color w:val="000000"/>
+        </w:rPr>
+        <w:t>Quando a polícia apreende um celular numa investigação desse tamanho, os peritos recuperam tudo o que está ali dentro. Fotos e documentos. E mensagens. Cada conversa, com quem ela aconteceu e a que horas.</w:t>
       </w:r>
     </w:p>
     <w:p>

</xml_diff>